<commit_message>
English Q1-style paper + appendices + real standardized path figures; second Persian paper (pressure configuration); fix Persian figure shaping in all papers; fix DOI italics in English docs
Co-Authored-By: Claude Sonnet 5.5 <noreply@anthropic.com>
Claude-Session: https://claude.ai/code/session_01B6hBNJS5eMNFXmCvfzEnc8
</commit_message>
<xml_diff>
--- a/fomo_two_papers/deliverables/paper3/Paper3_Manuscript_EN.docx
+++ b/fomo_two_papers/deliverables/paper3/Paper3_Manuscript_EN.docx
@@ -9507,18 +9507,7 @@
           <w:szCs w:val="22"/>
           <w:lang w:val="en-US" w:bidi="fa-IR"/>
         </w:rPr>
-        <w:t xml:space="preserve">(2), 773–806. https:</w:t>
-      </w:r>
-      <w:r>
-        <w:rPr>
-          <w:rFonts w:ascii="Times New Roman" w:hAnsi="Times New Roman" w:cs="Times New Roman" w:eastAsia="Times New Roman"/>
-          <w:i/>
-          <w:iCs/>
-          <w:sz w:val="22"/>
-          <w:szCs w:val="22"/>
-          <w:lang w:val="en-US" w:bidi="fa-IR"/>
-        </w:rPr>
-        <w:t xml:space="preserve">doi.org/10.1111/0022-1082.00226</w:t>
+        <w:t xml:space="preserve">(2), 773–806. https://doi.org/10.1111/0022-1082.00226</w:t>
       </w:r>
     </w:p>
     <w:p>
@@ -9554,18 +9543,7 @@
           <w:szCs w:val="22"/>
           <w:lang w:val="en-US" w:bidi="fa-IR"/>
         </w:rPr>
-        <w:t xml:space="preserve">(1), 261–292. https:</w:t>
-      </w:r>
-      <w:r>
-        <w:rPr>
-          <w:rFonts w:ascii="Times New Roman" w:hAnsi="Times New Roman" w:cs="Times New Roman" w:eastAsia="Times New Roman"/>
-          <w:i/>
-          <w:iCs/>
-          <w:sz w:val="22"/>
-          <w:szCs w:val="22"/>
-          <w:lang w:val="en-US" w:bidi="fa-IR"/>
-        </w:rPr>
-        <w:t xml:space="preserve">doi.org/10.1162/003355301556400</w:t>
+        <w:t xml:space="preserve">(1), 261–292. https://doi.org/10.1162/003355301556400</w:t>
       </w:r>
     </w:p>
     <w:p>
@@ -9601,18 +9579,7 @@
           <w:szCs w:val="22"/>
           <w:lang w:val="en-US" w:bidi="fa-IR"/>
         </w:rPr>
-        <w:t xml:space="preserve">(5), 938–956. https:</w:t>
-      </w:r>
-      <w:r>
-        <w:rPr>
-          <w:rFonts w:ascii="Times New Roman" w:hAnsi="Times New Roman" w:cs="Times New Roman" w:eastAsia="Times New Roman"/>
-          <w:i/>
-          <w:iCs/>
-          <w:sz w:val="22"/>
-          <w:szCs w:val="22"/>
-          <w:lang w:val="en-US" w:bidi="fa-IR"/>
-        </w:rPr>
-        <w:t xml:space="preserve">doi.org/10.1037/0022-3514.92.5.938</w:t>
+        <w:t xml:space="preserve">(5), 938–956. https://doi.org/10.1037/0022-3514.92.5.938</w:t>
       </w:r>
     </w:p>
     <w:p>
@@ -9648,18 +9615,7 @@
           <w:szCs w:val="22"/>
           <w:lang w:val="en-US" w:bidi="fa-IR"/>
         </w:rPr>
-        <w:t xml:space="preserve">(5), 1983–2020. https:</w:t>
-      </w:r>
-      <w:r>
-        <w:rPr>
-          <w:rFonts w:ascii="Times New Roman" w:hAnsi="Times New Roman" w:cs="Times New Roman" w:eastAsia="Times New Roman"/>
-          <w:i/>
-          <w:iCs/>
-          <w:sz w:val="22"/>
-          <w:szCs w:val="22"/>
-          <w:lang w:val="en-US" w:bidi="fa-IR"/>
-        </w:rPr>
-        <w:t xml:space="preserve">doi.org/10.1093/rfs/hhz014</w:t>
+        <w:t xml:space="preserve">(5), 1983–2020. https://doi.org/10.1093/rfs/hhz014</w:t>
       </w:r>
     </w:p>
     <w:p>
@@ -9695,18 +9651,7 @@
           <w:szCs w:val="22"/>
           <w:lang w:val="en-US" w:bidi="fa-IR"/>
         </w:rPr>
-        <w:t xml:space="preserve">(1), 114–126. https:</w:t>
-      </w:r>
-      <w:r>
-        <w:rPr>
-          <w:rFonts w:ascii="Times New Roman" w:hAnsi="Times New Roman" w:cs="Times New Roman" w:eastAsia="Times New Roman"/>
-          <w:i/>
-          <w:iCs/>
-          <w:sz w:val="22"/>
-          <w:szCs w:val="22"/>
-          <w:lang w:val="en-US" w:bidi="fa-IR"/>
-        </w:rPr>
-        <w:t xml:space="preserve">doi.org/10.1037/xge0000033</w:t>
+        <w:t xml:space="preserve">(1), 114–126. https://doi.org/10.1037/xge0000033</w:t>
       </w:r>
     </w:p>
     <w:p>
@@ -9742,18 +9687,7 @@
           <w:szCs w:val="22"/>
           <w:lang w:val="en-US" w:bidi="fa-IR"/>
         </w:rPr>
-        <w:t xml:space="preserve">(1), 98–121. https:</w:t>
-      </w:r>
-      <w:r>
-        <w:rPr>
-          <w:rFonts w:ascii="Times New Roman" w:hAnsi="Times New Roman" w:cs="Times New Roman" w:eastAsia="Times New Roman"/>
-          <w:i/>
-          <w:iCs/>
-          <w:sz w:val="22"/>
-          <w:szCs w:val="22"/>
-          <w:lang w:val="en-US" w:bidi="fa-IR"/>
-        </w:rPr>
-        <w:t xml:space="preserve">doi.org/10.1016/j.obhdp.2007.05.002</w:t>
+        <w:t xml:space="preserve">(1), 98–121. https://doi.org/10.1016/j.obhdp.2007.05.002</w:t>
       </w:r>
     </w:p>
     <w:p>
@@ -9789,18 +9723,7 @@
           <w:szCs w:val="22"/>
           <w:lang w:val="en-US" w:bidi="fa-IR"/>
         </w:rPr>
-        <w:t xml:space="preserve">(1), 39–50. https:</w:t>
-      </w:r>
-      <w:r>
-        <w:rPr>
-          <w:rFonts w:ascii="Times New Roman" w:hAnsi="Times New Roman" w:cs="Times New Roman" w:eastAsia="Times New Roman"/>
-          <w:i/>
-          <w:iCs/>
-          <w:sz w:val="22"/>
-          <w:szCs w:val="22"/>
-          <w:lang w:val="en-US" w:bidi="fa-IR"/>
-        </w:rPr>
-        <w:t xml:space="preserve">doi.org/10.1177/002224378101800104</w:t>
+        <w:t xml:space="preserve">(1), 39–50. https://doi.org/10.1177/002224378101800104</w:t>
       </w:r>
     </w:p>
     <w:p>
@@ -9836,18 +9759,7 @@
           <w:szCs w:val="22"/>
           <w:lang w:val="en-US" w:bidi="fa-IR"/>
         </w:rPr>
-        <w:t xml:space="preserve">(1), 1–36. https:</w:t>
-      </w:r>
-      <w:r>
-        <w:rPr>
-          <w:rFonts w:ascii="Times New Roman" w:hAnsi="Times New Roman" w:cs="Times New Roman" w:eastAsia="Times New Roman"/>
-          <w:i/>
-          <w:iCs/>
-          <w:sz w:val="22"/>
-          <w:szCs w:val="22"/>
-          <w:lang w:val="en-US" w:bidi="fa-IR"/>
-        </w:rPr>
-        <w:t xml:space="preserve">doi.org/10.1007/s10713-007-0003-3</w:t>
+        <w:t xml:space="preserve">(1), 1–36. https://doi.org/10.1007/s10713-007-0003-3</w:t>
       </w:r>
     </w:p>
     <w:p>
@@ -9883,18 +9795,7 @@
           <w:szCs w:val="22"/>
           <w:lang w:val="en-US" w:bidi="fa-IR"/>
         </w:rPr>
-        <w:t xml:space="preserve">(1), 121–127. https:</w:t>
-      </w:r>
-      <w:r>
-        <w:rPr>
-          <w:rFonts w:ascii="Times New Roman" w:hAnsi="Times New Roman" w:cs="Times New Roman" w:eastAsia="Times New Roman"/>
-          <w:i/>
-          <w:iCs/>
-          <w:sz w:val="22"/>
-          <w:szCs w:val="22"/>
-          <w:lang w:val="en-US" w:bidi="fa-IR"/>
-        </w:rPr>
-        <w:t xml:space="preserve">doi.org/10.1136/amiajnl-2011-000089</w:t>
+        <w:t xml:space="preserve">(1), 121–127. https://doi.org/10.1136/amiajnl-2011-000089</w:t>
       </w:r>
     </w:p>
     <w:p>
@@ -9930,18 +9831,7 @@
           <w:szCs w:val="22"/>
           <w:lang w:val="en-US" w:bidi="fa-IR"/>
         </w:rPr>
-        <w:t xml:space="preserve">(2), 549–578. https:</w:t>
-      </w:r>
-      <w:r>
-        <w:rPr>
-          <w:rFonts w:ascii="Times New Roman" w:hAnsi="Times New Roman" w:cs="Times New Roman" w:eastAsia="Times New Roman"/>
-          <w:i/>
-          <w:iCs/>
-          <w:sz w:val="22"/>
-          <w:szCs w:val="22"/>
-          <w:lang w:val="en-US" w:bidi="fa-IR"/>
-        </w:rPr>
-        <w:t xml:space="preserve">doi.org/10.1111/j.1540-6261.2009.01443.x</w:t>
+        <w:t xml:space="preserve">(2), 549–578. https://doi.org/10.1111/j.1540-6261.2009.01443.x</w:t>
       </w:r>
     </w:p>
     <w:p>
@@ -9977,18 +9867,7 @@
           <w:szCs w:val="22"/>
           <w:lang w:val="en-US" w:bidi="fa-IR"/>
         </w:rPr>
-        <w:t xml:space="preserve">(1), 1–22. https:</w:t>
-      </w:r>
-      <w:r>
-        <w:rPr>
-          <w:rFonts w:ascii="Times New Roman" w:hAnsi="Times New Roman" w:cs="Times New Roman" w:eastAsia="Times New Roman"/>
-          <w:i/>
-          <w:iCs/>
-          <w:sz w:val="22"/>
-          <w:szCs w:val="22"/>
-          <w:lang w:val="en-US" w:bidi="fa-IR"/>
-        </w:rPr>
-        <w:t xml:space="preserve">doi.org/10.1080/00273171.2014.962683</w:t>
+        <w:t xml:space="preserve">(1), 1–22. https://doi.org/10.1080/00273171.2014.962683</w:t>
       </w:r>
     </w:p>
     <w:p>
@@ -10024,18 +9903,7 @@
           <w:szCs w:val="22"/>
           <w:lang w:val="en-US" w:bidi="fa-IR"/>
         </w:rPr>
-        <w:t xml:space="preserve">(1), 115–135. https:</w:t>
-      </w:r>
-      <w:r>
-        <w:rPr>
-          <w:rFonts w:ascii="Times New Roman" w:hAnsi="Times New Roman" w:cs="Times New Roman" w:eastAsia="Times New Roman"/>
-          <w:i/>
-          <w:iCs/>
-          <w:sz w:val="22"/>
-          <w:szCs w:val="22"/>
-          <w:lang w:val="en-US" w:bidi="fa-IR"/>
-        </w:rPr>
-        <w:t xml:space="preserve">doi.org/10.1007/s11747-014-0403-8</w:t>
+        <w:t xml:space="preserve">(1), 115–135. https://doi.org/10.1007/s11747-014-0403-8</w:t>
       </w:r>
     </w:p>
     <w:p>
@@ -10071,18 +9939,7 @@
           <w:szCs w:val="22"/>
           <w:lang w:val="en-US" w:bidi="fa-IR"/>
         </w:rPr>
-        <w:t xml:space="preserve">(3), 407–434. https:</w:t>
-      </w:r>
-      <w:r>
-        <w:rPr>
-          <w:rFonts w:ascii="Times New Roman" w:hAnsi="Times New Roman" w:cs="Times New Roman" w:eastAsia="Times New Roman"/>
-          <w:i/>
-          <w:iCs/>
-          <w:sz w:val="22"/>
-          <w:szCs w:val="22"/>
-          <w:lang w:val="en-US" w:bidi="fa-IR"/>
-        </w:rPr>
-        <w:t xml:space="preserve">doi.org/10.1177/0018720814547570</w:t>
+        <w:t xml:space="preserve">(3), 407–434. https://doi.org/10.1177/0018720814547570</w:t>
       </w:r>
     </w:p>
     <w:p>
@@ -10118,18 +9975,7 @@
           <w:szCs w:val="22"/>
           <w:lang w:val="en-US" w:bidi="fa-IR"/>
         </w:rPr>
-        <w:t xml:space="preserve">(1), 1–55. https:</w:t>
-      </w:r>
-      <w:r>
-        <w:rPr>
-          <w:rFonts w:ascii="Times New Roman" w:hAnsi="Times New Roman" w:cs="Times New Roman" w:eastAsia="Times New Roman"/>
-          <w:i/>
-          <w:iCs/>
-          <w:sz w:val="22"/>
-          <w:szCs w:val="22"/>
-          <w:lang w:val="en-US" w:bidi="fa-IR"/>
-        </w:rPr>
-        <w:t xml:space="preserve">doi.org/10.1080/10705519909540118</w:t>
+        <w:t xml:space="preserve">(1), 1–55. https://doi.org/10.1080/10705519909540118</w:t>
       </w:r>
     </w:p>
     <w:p>
@@ -10165,18 +10011,7 @@
           <w:szCs w:val="22"/>
           <w:lang w:val="en-US" w:bidi="fa-IR"/>
         </w:rPr>
-        <w:t xml:space="preserve">(6), 952–963. https:</w:t>
-      </w:r>
-      <w:r>
-        <w:rPr>
-          <w:rFonts w:ascii="Times New Roman" w:hAnsi="Times New Roman" w:cs="Times New Roman" w:eastAsia="Times New Roman"/>
-          <w:i/>
-          <w:iCs/>
-          <w:sz w:val="22"/>
-          <w:szCs w:val="22"/>
-          <w:lang w:val="en-US" w:bidi="fa-IR"/>
-        </w:rPr>
-        <w:t xml:space="preserve">doi.org/10.1080/10705511.2019.1704289</w:t>
+        <w:t xml:space="preserve">(6), 952–963. https://doi.org/10.1080/10705511.2019.1704289</w:t>
       </w:r>
     </w:p>
     <w:p>
@@ -10212,18 +10047,7 @@
           <w:szCs w:val="22"/>
           <w:lang w:val="en-US" w:bidi="fa-IR"/>
         </w:rPr>
-        <w:t xml:space="preserve">(12), Article 248. https:</w:t>
-      </w:r>
-      <w:r>
-        <w:rPr>
-          <w:rFonts w:ascii="Times New Roman" w:hAnsi="Times New Roman" w:cs="Times New Roman" w:eastAsia="Times New Roman"/>
-          <w:i/>
-          <w:iCs/>
-          <w:sz w:val="22"/>
-          <w:szCs w:val="22"/>
-          <w:lang w:val="en-US" w:bidi="fa-IR"/>
-        </w:rPr>
-        <w:t xml:space="preserve">doi.org/10.1145/3571730</w:t>
+        <w:t xml:space="preserve">(12), Article 248. https://doi.org/10.1145/3571730</w:t>
       </w:r>
     </w:p>
     <w:p>
@@ -10259,18 +10083,7 @@
           <w:szCs w:val="22"/>
           <w:lang w:val="en-US" w:bidi="fa-IR"/>
         </w:rPr>
-        <w:t xml:space="preserve">(6), 1121–1134. https:</w:t>
-      </w:r>
-      <w:r>
-        <w:rPr>
-          <w:rFonts w:ascii="Times New Roman" w:hAnsi="Times New Roman" w:cs="Times New Roman" w:eastAsia="Times New Roman"/>
-          <w:i/>
-          <w:iCs/>
-          <w:sz w:val="22"/>
-          <w:szCs w:val="22"/>
-          <w:lang w:val="en-US" w:bidi="fa-IR"/>
-        </w:rPr>
-        <w:t xml:space="preserve">doi.org/10.1037/0022-3514.77.6.1121</w:t>
+        <w:t xml:space="preserve">(6), 1121–1134. https://doi.org/10.1037/0022-3514.77.6.1121</w:t>
       </w:r>
     </w:p>
     <w:p>
@@ -10306,18 +10119,7 @@
           <w:szCs w:val="22"/>
           <w:lang w:val="en-US" w:bidi="fa-IR"/>
         </w:rPr>
-        <w:t xml:space="preserve">(1), 50–80. https:</w:t>
-      </w:r>
-      <w:r>
-        <w:rPr>
-          <w:rFonts w:ascii="Times New Roman" w:hAnsi="Times New Roman" w:cs="Times New Roman" w:eastAsia="Times New Roman"/>
-          <w:i/>
-          <w:iCs/>
-          <w:sz w:val="22"/>
-          <w:szCs w:val="22"/>
-          <w:lang w:val="en-US" w:bidi="fa-IR"/>
-        </w:rPr>
-        <w:t xml:space="preserve">doi.org/10.1518/hfes.46.1.50_30392</w:t>
+        <w:t xml:space="preserve">(1), 50–80. https://doi.org/10.1518/hfes.46.1.50_30392</w:t>
       </w:r>
     </w:p>
     <w:p>
@@ -10353,18 +10155,7 @@
           <w:szCs w:val="22"/>
           <w:lang w:val="en-US" w:bidi="fa-IR"/>
         </w:rPr>
-        <w:t xml:space="preserve">(4), 497–519. https:</w:t>
-      </w:r>
-      <w:r>
-        <w:rPr>
-          <w:rFonts w:ascii="Times New Roman" w:hAnsi="Times New Roman" w:cs="Times New Roman" w:eastAsia="Times New Roman"/>
-          <w:i/>
-          <w:iCs/>
-          <w:sz w:val="22"/>
-          <w:szCs w:val="22"/>
-          <w:lang w:val="en-US" w:bidi="fa-IR"/>
-        </w:rPr>
-        <w:t xml:space="preserve">doi.org/10.1207/s15328007sem1304_1</w:t>
+        <w:t xml:space="preserve">(4), 497–519. https://doi.org/10.1207/s15328007sem1304_1</w:t>
       </w:r>
     </w:p>
     <w:p>
@@ -10400,18 +10191,7 @@
           <w:szCs w:val="22"/>
           <w:lang w:val="en-US" w:bidi="fa-IR"/>
         </w:rPr>
-        <w:t xml:space="preserve">, 90–103. https:</w:t>
-      </w:r>
-      <w:r>
-        <w:rPr>
-          <w:rFonts w:ascii="Times New Roman" w:hAnsi="Times New Roman" w:cs="Times New Roman" w:eastAsia="Times New Roman"/>
-          <w:i/>
-          <w:iCs/>
-          <w:sz w:val="22"/>
-          <w:szCs w:val="22"/>
-          <w:lang w:val="en-US" w:bidi="fa-IR"/>
-        </w:rPr>
-        <w:t xml:space="preserve">doi.org/10.1016/j.obhdp.2018.12.005</w:t>
+        <w:t xml:space="preserve">, 90–103. https://doi.org/10.1016/j.obhdp.2018.12.005</w:t>
       </w:r>
     </w:p>
     <w:p>
@@ -10447,18 +10227,7 @@
           <w:szCs w:val="22"/>
           <w:lang w:val="en-US" w:bidi="fa-IR"/>
         </w:rPr>
-        <w:t xml:space="preserve"> (pp. 1–16). ACM. https:</w:t>
-      </w:r>
-      <w:r>
-        <w:rPr>
-          <w:rFonts w:ascii="Times New Roman" w:hAnsi="Times New Roman" w:cs="Times New Roman" w:eastAsia="Times New Roman"/>
-          <w:i/>
-          <w:iCs/>
-          <w:sz w:val="22"/>
-          <w:szCs w:val="22"/>
-          <w:lang w:val="en-US" w:bidi="fa-IR"/>
-        </w:rPr>
-        <w:t xml:space="preserve">doi.org/10.1145/3313831.3376727</w:t>
+        <w:t xml:space="preserve"> (pp. 1–16). ACM. https://doi.org/10.1145/3313831.3376727</w:t>
       </w:r>
     </w:p>
     <w:p>
@@ -10494,18 +10263,7 @@
           <w:szCs w:val="22"/>
           <w:lang w:val="en-US" w:bidi="fa-IR"/>
         </w:rPr>
-        <w:t xml:space="preserve">. https:</w:t>
-      </w:r>
-      <w:r>
-        <w:rPr>
-          <w:rFonts w:ascii="Times New Roman" w:hAnsi="Times New Roman" w:cs="Times New Roman" w:eastAsia="Times New Roman"/>
-          <w:i/>
-          <w:iCs/>
-          <w:sz w:val="22"/>
-          <w:szCs w:val="22"/>
-          <w:lang w:val="en-US" w:bidi="fa-IR"/>
-        </w:rPr>
-        <w:t xml:space="preserve">doi.org/10.2139/ssrn.4412788</w:t>
+        <w:t xml:space="preserve">. https://doi.org/10.2139/ssrn.4412788</w:t>
       </w:r>
     </w:p>
     <w:p>
@@ -10541,18 +10299,7 @@
           <w:szCs w:val="22"/>
           <w:lang w:val="en-US" w:bidi="fa-IR"/>
         </w:rPr>
-        <w:t xml:space="preserve">(1), 5–44. https:</w:t>
-      </w:r>
-      <w:r>
-        <w:rPr>
-          <w:rFonts w:ascii="Times New Roman" w:hAnsi="Times New Roman" w:cs="Times New Roman" w:eastAsia="Times New Roman"/>
-          <w:i/>
-          <w:iCs/>
-          <w:sz w:val="22"/>
-          <w:szCs w:val="22"/>
-          <w:lang w:val="en-US" w:bidi="fa-IR"/>
-        </w:rPr>
-        <w:t xml:space="preserve">doi.org/10.1257/jel.52.1.5</w:t>
+        <w:t xml:space="preserve">(1), 5–44. https://doi.org/10.1257/jel.52.1.5</w:t>
       </w:r>
     </w:p>
     <w:p>
@@ -10588,18 +10335,7 @@
           <w:szCs w:val="22"/>
           <w:lang w:val="en-US" w:bidi="fa-IR"/>
         </w:rPr>
-        <w:t xml:space="preserve">(2), 130–149. https:</w:t>
-      </w:r>
-      <w:r>
-        <w:rPr>
-          <w:rFonts w:ascii="Times New Roman" w:hAnsi="Times New Roman" w:cs="Times New Roman" w:eastAsia="Times New Roman"/>
-          <w:i/>
-          <w:iCs/>
-          <w:sz w:val="22"/>
-          <w:szCs w:val="22"/>
-          <w:lang w:val="en-US" w:bidi="fa-IR"/>
-        </w:rPr>
-        <w:t xml:space="preserve">doi.org/10.1037/1082-989X.1.2.130</w:t>
+        <w:t xml:space="preserve">(2), 130–149. https://doi.org/10.1037/1082-989X.1.2.130</w:t>
       </w:r>
     </w:p>
     <w:p>
@@ -10635,18 +10371,7 @@
           <w:szCs w:val="22"/>
           <w:lang w:val="en-US" w:bidi="fa-IR"/>
         </w:rPr>
-        <w:t xml:space="preserve">(3), 275–300. https:</w:t>
-      </w:r>
-      <w:r>
-        <w:rPr>
-          <w:rFonts w:ascii="Times New Roman" w:hAnsi="Times New Roman" w:cs="Times New Roman" w:eastAsia="Times New Roman"/>
-          <w:i/>
-          <w:iCs/>
-          <w:sz w:val="22"/>
-          <w:szCs w:val="22"/>
-          <w:lang w:val="en-US" w:bidi="fa-IR"/>
-        </w:rPr>
-        <w:t xml:space="preserve">doi.org/10.1037/1082-989X.9.3.275</w:t>
+        <w:t xml:space="preserve">(3), 275–300. https://doi.org/10.1037/1082-989X.9.3.275</w:t>
       </w:r>
     </w:p>
     <w:p>
@@ -10682,18 +10407,7 @@
           <w:szCs w:val="22"/>
           <w:lang w:val="en-US" w:bidi="fa-IR"/>
         </w:rPr>
-        <w:t xml:space="preserve">(8002), 49–58. https:</w:t>
-      </w:r>
-      <w:r>
-        <w:rPr>
-          <w:rFonts w:ascii="Times New Roman" w:hAnsi="Times New Roman" w:cs="Times New Roman" w:eastAsia="Times New Roman"/>
-          <w:i/>
-          <w:iCs/>
-          <w:sz w:val="22"/>
-          <w:szCs w:val="22"/>
-          <w:lang w:val="en-US" w:bidi="fa-IR"/>
-        </w:rPr>
-        <w:t xml:space="preserve">doi.org/10.1038/s41586-024-07146-0</w:t>
+        <w:t xml:space="preserve">(8002), 49–58. https://doi.org/10.1038/s41586-024-07146-0</w:t>
       </w:r>
     </w:p>
     <w:p>
@@ -10729,18 +10443,7 @@
           <w:szCs w:val="22"/>
           <w:lang w:val="en-US" w:bidi="fa-IR"/>
         </w:rPr>
-        <w:t xml:space="preserve">(2), 502–517. https:</w:t>
-      </w:r>
-      <w:r>
-        <w:rPr>
-          <w:rFonts w:ascii="Times New Roman" w:hAnsi="Times New Roman" w:cs="Times New Roman" w:eastAsia="Times New Roman"/>
-          <w:i/>
-          <w:iCs/>
-          <w:sz w:val="22"/>
-          <w:szCs w:val="22"/>
-          <w:lang w:val="en-US" w:bidi="fa-IR"/>
-        </w:rPr>
-        <w:t xml:space="preserve">doi.org/10.1037/0033-295X.115.2.502</w:t>
+        <w:t xml:space="preserve">(2), 502–517. https://doi.org/10.1037/0033-295X.115.2.502</w:t>
       </w:r>
     </w:p>
     <w:p>
@@ -10776,18 +10479,7 @@
           <w:szCs w:val="22"/>
           <w:lang w:val="en-US" w:bidi="fa-IR"/>
         </w:rPr>
-        <w:t xml:space="preserve">, 100041. https:</w:t>
-      </w:r>
-      <w:r>
-        <w:rPr>
-          <w:rFonts w:ascii="Times New Roman" w:hAnsi="Times New Roman" w:cs="Times New Roman" w:eastAsia="Times New Roman"/>
-          <w:i/>
-          <w:iCs/>
-          <w:sz w:val="22"/>
-          <w:szCs w:val="22"/>
-          <w:lang w:val="en-US" w:bidi="fa-IR"/>
-        </w:rPr>
-        <w:t xml:space="preserve">doi.org/10.1016/j.caeai.2021.100041</w:t>
+        <w:t xml:space="preserve">, 100041. https://doi.org/10.1016/j.caeai.2021.100041</w:t>
       </w:r>
     </w:p>
     <w:p>
@@ -10823,18 +10515,7 @@
           <w:szCs w:val="22"/>
           <w:lang w:val="en-US" w:bidi="fa-IR"/>
         </w:rPr>
-        <w:t xml:space="preserve">(3), 381–410. https:</w:t>
-      </w:r>
-      <w:r>
-        <w:rPr>
-          <w:rFonts w:ascii="Times New Roman" w:hAnsi="Times New Roman" w:cs="Times New Roman" w:eastAsia="Times New Roman"/>
-          <w:i/>
-          <w:iCs/>
-          <w:sz w:val="22"/>
-          <w:szCs w:val="22"/>
-          <w:lang w:val="en-US" w:bidi="fa-IR"/>
-        </w:rPr>
-        <w:t xml:space="preserve">doi.org/10.1177/0018720810376055</w:t>
+        <w:t xml:space="preserve">(3), 381–410. https://doi.org/10.1177/0018720810376055</w:t>
       </w:r>
     </w:p>
     <w:p>
@@ -10870,18 +10551,7 @@
           <w:szCs w:val="22"/>
           <w:lang w:val="en-US" w:bidi="fa-IR"/>
         </w:rPr>
-        <w:t xml:space="preserve">(1), 1–27. https:</w:t>
-      </w:r>
-      <w:r>
-        <w:rPr>
-          <w:rFonts w:ascii="Times New Roman" w:hAnsi="Times New Roman" w:cs="Times New Roman" w:eastAsia="Times New Roman"/>
-          <w:i/>
-          <w:iCs/>
-          <w:sz w:val="22"/>
-          <w:szCs w:val="22"/>
-          <w:lang w:val="en-US" w:bidi="fa-IR"/>
-        </w:rPr>
-        <w:t xml:space="preserve">doi.org/10.1002/bdm.481</w:t>
+        <w:t xml:space="preserve">(1), 1–27. https://doi.org/10.1002/bdm.481</w:t>
       </w:r>
     </w:p>
     <w:p>
@@ -10917,18 +10587,7 @@
           <w:szCs w:val="22"/>
           <w:lang w:val="en-US" w:bidi="fa-IR"/>
         </w:rPr>
-        <w:t xml:space="preserve">(5), 879–903. https:</w:t>
-      </w:r>
-      <w:r>
-        <w:rPr>
-          <w:rFonts w:ascii="Times New Roman" w:hAnsi="Times New Roman" w:cs="Times New Roman" w:eastAsia="Times New Roman"/>
-          <w:i/>
-          <w:iCs/>
-          <w:sz w:val="22"/>
-          <w:szCs w:val="22"/>
-          <w:lang w:val="en-US" w:bidi="fa-IR"/>
-        </w:rPr>
-        <w:t xml:space="preserve">doi.org/10.1037/0021-9010.88.5.879</w:t>
+        <w:t xml:space="preserve">(5), 879–903. https://doi.org/10.1037/0021-9010.88.5.879</w:t>
       </w:r>
     </w:p>
     <w:p>
@@ -10964,18 +10623,7 @@
           <w:szCs w:val="22"/>
           <w:lang w:val="en-US" w:bidi="fa-IR"/>
         </w:rPr>
-        <w:t xml:space="preserve">(3), 879–891. https:</w:t>
-      </w:r>
-      <w:r>
-        <w:rPr>
-          <w:rFonts w:ascii="Times New Roman" w:hAnsi="Times New Roman" w:cs="Times New Roman" w:eastAsia="Times New Roman"/>
-          <w:i/>
-          <w:iCs/>
-          <w:sz w:val="22"/>
-          <w:szCs w:val="22"/>
-          <w:lang w:val="en-US" w:bidi="fa-IR"/>
-        </w:rPr>
-        <w:t xml:space="preserve">doi.org/10.3758/BRM.40.3.879</w:t>
+        <w:t xml:space="preserve">(3), 879–891. https://doi.org/10.3758/BRM.40.3.879</w:t>
       </w:r>
     </w:p>
     <w:p>
@@ -11011,18 +10659,7 @@
           <w:szCs w:val="22"/>
           <w:lang w:val="en-US" w:bidi="fa-IR"/>
         </w:rPr>
-        <w:t xml:space="preserve">(5), 991–1006. https:</w:t>
-      </w:r>
-      <w:r>
-        <w:rPr>
-          <w:rFonts w:ascii="Times New Roman" w:hAnsi="Times New Roman" w:cs="Times New Roman" w:eastAsia="Times New Roman"/>
-          <w:i/>
-          <w:iCs/>
-          <w:sz w:val="22"/>
-          <w:szCs w:val="22"/>
-          <w:lang w:val="en-US" w:bidi="fa-IR"/>
-        </w:rPr>
-        <w:t xml:space="preserve">doi.org/10.1006/ijhc.1999.0252</w:t>
+        <w:t xml:space="preserve">(5), 991–1006. https://doi.org/10.1006/ijhc.1999.0252</w:t>
       </w:r>
     </w:p>
     <w:p>
@@ -11058,18 +10695,7 @@
           <w:szCs w:val="22"/>
           <w:lang w:val="en-US" w:bidi="fa-IR"/>
         </w:rPr>
-        <w:t xml:space="preserve">(2), 449–472. https:</w:t>
-      </w:r>
-      <w:r>
-        <w:rPr>
-          <w:rFonts w:ascii="Times New Roman" w:hAnsi="Times New Roman" w:cs="Times New Roman" w:eastAsia="Times New Roman"/>
-          <w:i/>
-          <w:iCs/>
-          <w:sz w:val="22"/>
-          <w:szCs w:val="22"/>
-          <w:lang w:val="en-US" w:bidi="fa-IR"/>
-        </w:rPr>
-        <w:t xml:space="preserve">doi.org/10.1016/j.jfineco.2011.03.006</w:t>
+        <w:t xml:space="preserve">(2), 449–472. https://doi.org/10.1016/j.jfineco.2011.03.006</w:t>
       </w:r>
     </w:p>
     <w:p>
@@ -11105,18 +10731,7 @@
           <w:szCs w:val="22"/>
           <w:lang w:val="en-US" w:bidi="fa-IR"/>
         </w:rPr>
-        <w:t xml:space="preserve">(9), 1324–1337. https:</w:t>
-      </w:r>
-      <w:r>
-        <w:rPr>
-          <w:rFonts w:ascii="Times New Roman" w:hAnsi="Times New Roman" w:cs="Times New Roman" w:eastAsia="Times New Roman"/>
-          <w:i/>
-          <w:iCs/>
-          <w:sz w:val="22"/>
-          <w:szCs w:val="22"/>
-          <w:lang w:val="en-US" w:bidi="fa-IR"/>
-        </w:rPr>
-        <w:t xml:space="preserve">doi.org/10.1080/0144929X.2022.2072768</w:t>
+        <w:t xml:space="preserve">(9), 1324–1337. https://doi.org/10.1080/0144929X.2022.2072768</w:t>
       </w:r>
     </w:p>
     <w:p>

</xml_diff>